<commit_message>
KB-4 FAQ: document the assigned-items listing capability
Co-Authored-By: Claude Opus 4.8 (1M context) <noreply@anthropic.com>
</commit_message>
<xml_diff>
--- a/knowledge/dist/KB-4 Using This Agent/4.1 What This Agent Can and Can't Do (FAQ).docx
+++ b/knowledge/dist/KB-4 Using This Agent/4.1 What This Agent Can and Can't Do (FAQ).docx
@@ -123,13 +123,31 @@
           <w:b/>
           <w:bCs/>
         </w:rPr>
-        <w:t xml:space="preserve">Create</w:t>
-      </w:r>
-      <w:r>
-        <w:t xml:space="preserve"> </w:t>
-      </w:r>
-      <w:r>
-        <w:t xml:space="preserve">Features, User Stories, and Tasks — either a single item or a whole Feature → Story → Task tree in one request — after a short quality interview and a duplicate check.</w:t>
+        <w:t xml:space="preserve">List what’s assigned to you</w:t>
+      </w:r>
+      <w:r>
+        <w:t xml:space="preserve"> </w:t>
+      </w:r>
+      <w:r>
+        <w:t xml:space="preserve">— ask</w:t>
+      </w:r>
+      <w:r>
+        <w:t xml:space="preserve"> </w:t>
+      </w:r>
+      <w:r>
+        <w:t xml:space="preserve">“show me my work items”</w:t>
+      </w:r>
+      <w:r>
+        <w:t xml:space="preserve"> </w:t>
+      </w:r>
+      <w:r>
+        <w:t xml:space="preserve">(or name a teammate, e.g. </w:t>
+      </w:r>
+      <w:r>
+        <w:t xml:space="preserve">“what’s assigned to jane@org.com?”</w:t>
+      </w:r>
+      <w:r>
+        <w:t xml:space="preserve">). Shows active items by default, grouped by state; ask for closed items or a specific type to narrow.</w:t>
       </w:r>
     </w:p>
     <w:p>
@@ -145,13 +163,13 @@
           <w:b/>
           <w:bCs/>
         </w:rPr>
-        <w:t xml:space="preserve">Update</w:t>
-      </w:r>
-      <w:r>
-        <w:t xml:space="preserve"> </w:t>
-      </w:r>
-      <w:r>
-        <w:t xml:space="preserve">existing Features, User Stories, and Tasks — change fields such as description, acceptance criteria, priority, estimates, value area, or release/deploy/feature-flag notes.</w:t>
+        <w:t xml:space="preserve">Create</w:t>
+      </w:r>
+      <w:r>
+        <w:t xml:space="preserve"> </w:t>
+      </w:r>
+      <w:r>
+        <w:t xml:space="preserve">Features, User Stories, and Tasks — either a single item or a whole Feature → Story → Task tree in one request — after a short quality interview and a duplicate check.</w:t>
       </w:r>
     </w:p>
     <w:p>
@@ -167,6 +185,28 @@
           <w:b/>
           <w:bCs/>
         </w:rPr>
+        <w:t xml:space="preserve">Update</w:t>
+      </w:r>
+      <w:r>
+        <w:t xml:space="preserve"> </w:t>
+      </w:r>
+      <w:r>
+        <w:t xml:space="preserve">existing Features, User Stories, and Tasks — change fields such as description, acceptance criteria, priority, estimates, value area, or release/deploy/feature-flag notes.</w:t>
+      </w:r>
+    </w:p>
+    <w:p>
+      <w:pPr>
+        <w:pStyle w:val="Compact"/>
+        <w:numPr>
+          <w:ilvl w:val="0"/>
+          <w:numId w:val="1001"/>
+        </w:numPr>
+      </w:pPr>
+      <w:r>
+        <w:rPr>
+          <w:b/>
+          <w:bCs/>
+        </w:rPr>
         <w:t xml:space="preserve">Comment</w:t>
       </w:r>
       <w:r>
@@ -330,6 +370,55 @@
       </w:r>
       <w:r>
         <w:t xml:space="preserve">“Has anyone created a Story for [topic]?”</w:t>
+      </w:r>
+      <w:r>
+        <w:t xml:space="preserve"> </w:t>
+      </w:r>
+      <w:r>
+        <w:t xml:space="preserve">-</w:t>
+      </w:r>
+      <w:r>
+        <w:t xml:space="preserve"> </w:t>
+      </w:r>
+      <w:r>
+        <w:rPr>
+          <w:i/>
+          <w:iCs/>
+        </w:rPr>
+        <w:t xml:space="preserve">My items:</w:t>
+      </w:r>
+      <w:r>
+        <w:t xml:space="preserve"> </w:t>
+      </w:r>
+      <w:r>
+        <w:t xml:space="preserve">“Show me my work items”</w:t>
+      </w:r>
+      <w:r>
+        <w:t xml:space="preserve">,</w:t>
+      </w:r>
+      <w:r>
+        <w:t xml:space="preserve"> </w:t>
+      </w:r>
+      <w:r>
+        <w:t xml:space="preserve">“What am I working on?”</w:t>
+      </w:r>
+      <w:r>
+        <w:t xml:space="preserve">,</w:t>
+      </w:r>
+      <w:r>
+        <w:t xml:space="preserve"> </w:t>
+      </w:r>
+      <w:r>
+        <w:t xml:space="preserve">“List my open tasks”</w:t>
+      </w:r>
+      <w:r>
+        <w:t xml:space="preserve">,</w:t>
+      </w:r>
+      <w:r>
+        <w:t xml:space="preserve"> </w:t>
+      </w:r>
+      <w:r>
+        <w:t xml:space="preserve">“What’s assigned to jane@org.com?”</w:t>
       </w:r>
       <w:r>
         <w:t xml:space="preserve"> </w:t>

</xml_diff>